<commit_message>
Instruction blocks: fix Audit and Compliance Never-line (sub-agreement + term sheet are pre-acceptance, not accreditation-gated)
Co-Authored-By: Claude Opus 4.8 <noreply@anthropic.com>
</commit_message>
<xml_diff>
--- a/Enyrgy_Paperclip_Agent_Instruction_Blocks.docx
+++ b/Enyrgy_Paperclip_Agent_Instruction_Blocks.docx
@@ -1746,7 +1746,7 @@
         <w:t xml:space="preserve"> </w:t>
       </w:r>
       <w:r>
-        <w:t xml:space="preserve">allow cold-drip financial content (touches 1 through 6) to an unverified investor contact, allow a commitment action (subscription, term sheet, wire, or acceptance of investment) without verified accreditation, or approve investor material that is not attorney-approved. Do not block the PPM after the intro meeting; accreditation is not required for PPM delivery. When in doubt on a commitment action, block and escalate.</w:t>
+        <w:t xml:space="preserve">allow cold-drip financial content (touches 1 through 6) to an unverified investor contact, allow a money-moving action (wire instructions or acceptance of investment) without verified accreditation (the subscription agreement and term sheet are pre-acceptance and are NOT gated), or approve investor material that is not attorney-approved. Do not block the PPM after the intro meeting; accreditation is not required for PPM delivery. When in doubt on a commitment action, block and escalate.</w:t>
       </w:r>
     </w:p>
     <w:p>
@@ -4153,6 +4153,253 @@
       <w:szCs w:val="20"/>
     </w:rPr>
   </w:style>
+  <w:style w:customStyle="1" w:styleId="SourceCode" w:type="paragraph">
+    <w:name w:val="Source Code"/>
+    <w:basedOn w:val="Normal"/>
+    <w:link w:val="VerbatimChar"/>
+    <w:pPr>
+      <w:wordWrap w:val="off"/>
+    </w:pPr>
+  </w:style>
+  <w:style w:customStyle="1" w:styleId="KeywordTok" w:type="character">
+    <w:name w:val="KeywordTok"/>
+    <w:basedOn w:val="VerbatimChar"/>
+    <w:rPr>
+      <w:b/>
+      <w:color w:val="007020"/>
+    </w:rPr>
+  </w:style>
+  <w:style w:customStyle="1" w:styleId="DataTypeTok" w:type="character">
+    <w:name w:val="DataTypeTok"/>
+    <w:basedOn w:val="VerbatimChar"/>
+    <w:rPr>
+      <w:color w:val="902000"/>
+    </w:rPr>
+  </w:style>
+  <w:style w:customStyle="1" w:styleId="DecValTok" w:type="character">
+    <w:name w:val="DecValTok"/>
+    <w:basedOn w:val="VerbatimChar"/>
+    <w:rPr>
+      <w:color w:val="40a070"/>
+    </w:rPr>
+  </w:style>
+  <w:style w:customStyle="1" w:styleId="BaseNTok" w:type="character">
+    <w:name w:val="BaseNTok"/>
+    <w:basedOn w:val="VerbatimChar"/>
+    <w:rPr>
+      <w:color w:val="40a070"/>
+    </w:rPr>
+  </w:style>
+  <w:style w:customStyle="1" w:styleId="FloatTok" w:type="character">
+    <w:name w:val="FloatTok"/>
+    <w:basedOn w:val="VerbatimChar"/>
+    <w:rPr>
+      <w:color w:val="40a070"/>
+    </w:rPr>
+  </w:style>
+  <w:style w:customStyle="1" w:styleId="ConstantTok" w:type="character">
+    <w:name w:val="ConstantTok"/>
+    <w:basedOn w:val="VerbatimChar"/>
+    <w:rPr>
+      <w:color w:val="880000"/>
+    </w:rPr>
+  </w:style>
+  <w:style w:customStyle="1" w:styleId="CharTok" w:type="character">
+    <w:name w:val="CharTok"/>
+    <w:basedOn w:val="VerbatimChar"/>
+    <w:rPr>
+      <w:color w:val="4070a0"/>
+    </w:rPr>
+  </w:style>
+  <w:style w:customStyle="1" w:styleId="SpecialCharTok" w:type="character">
+    <w:name w:val="SpecialCharTok"/>
+    <w:basedOn w:val="VerbatimChar"/>
+    <w:rPr>
+      <w:color w:val="4070a0"/>
+    </w:rPr>
+  </w:style>
+  <w:style w:customStyle="1" w:styleId="StringTok" w:type="character">
+    <w:name w:val="StringTok"/>
+    <w:basedOn w:val="VerbatimChar"/>
+    <w:rPr>
+      <w:color w:val="4070a0"/>
+    </w:rPr>
+  </w:style>
+  <w:style w:customStyle="1" w:styleId="VerbatimStringTok" w:type="character">
+    <w:name w:val="VerbatimStringTok"/>
+    <w:basedOn w:val="VerbatimChar"/>
+    <w:rPr>
+      <w:color w:val="4070a0"/>
+    </w:rPr>
+  </w:style>
+  <w:style w:customStyle="1" w:styleId="SpecialStringTok" w:type="character">
+    <w:name w:val="SpecialStringTok"/>
+    <w:basedOn w:val="VerbatimChar"/>
+    <w:rPr>
+      <w:color w:val="bb6688"/>
+    </w:rPr>
+  </w:style>
+  <w:style w:customStyle="1" w:styleId="ImportTok" w:type="character">
+    <w:name w:val="ImportTok"/>
+    <w:basedOn w:val="VerbatimChar"/>
+    <w:rPr>
+      <w:b/>
+      <w:color w:val="008000"/>
+    </w:rPr>
+  </w:style>
+  <w:style w:customStyle="1" w:styleId="CommentTok" w:type="character">
+    <w:name w:val="CommentTok"/>
+    <w:basedOn w:val="VerbatimChar"/>
+    <w:rPr>
+      <w:i/>
+      <w:color w:val="60a0b0"/>
+    </w:rPr>
+  </w:style>
+  <w:style w:customStyle="1" w:styleId="DocumentationTok" w:type="character">
+    <w:name w:val="DocumentationTok"/>
+    <w:basedOn w:val="VerbatimChar"/>
+    <w:rPr>
+      <w:i/>
+      <w:color w:val="ba2121"/>
+    </w:rPr>
+  </w:style>
+  <w:style w:customStyle="1" w:styleId="AnnotationTok" w:type="character">
+    <w:name w:val="AnnotationTok"/>
+    <w:basedOn w:val="VerbatimChar"/>
+    <w:rPr>
+      <w:b/>
+      <w:i/>
+      <w:color w:val="60a0b0"/>
+    </w:rPr>
+  </w:style>
+  <w:style w:customStyle="1" w:styleId="CommentVarTok" w:type="character">
+    <w:name w:val="CommentVarTok"/>
+    <w:basedOn w:val="VerbatimChar"/>
+    <w:rPr>
+      <w:b/>
+      <w:i/>
+      <w:color w:val="60a0b0"/>
+    </w:rPr>
+  </w:style>
+  <w:style w:customStyle="1" w:styleId="OtherTok" w:type="character">
+    <w:name w:val="OtherTok"/>
+    <w:basedOn w:val="VerbatimChar"/>
+    <w:rPr>
+      <w:color w:val="007020"/>
+    </w:rPr>
+  </w:style>
+  <w:style w:customStyle="1" w:styleId="FunctionTok" w:type="character">
+    <w:name w:val="FunctionTok"/>
+    <w:basedOn w:val="VerbatimChar"/>
+    <w:rPr>
+      <w:color w:val="06287e"/>
+    </w:rPr>
+  </w:style>
+  <w:style w:customStyle="1" w:styleId="VariableTok" w:type="character">
+    <w:name w:val="VariableTok"/>
+    <w:basedOn w:val="VerbatimChar"/>
+    <w:rPr>
+      <w:color w:val="19177c"/>
+    </w:rPr>
+  </w:style>
+  <w:style w:customStyle="1" w:styleId="ControlFlowTok" w:type="character">
+    <w:name w:val="ControlFlowTok"/>
+    <w:basedOn w:val="VerbatimChar"/>
+    <w:rPr>
+      <w:b/>
+      <w:color w:val="007020"/>
+    </w:rPr>
+  </w:style>
+  <w:style w:customStyle="1" w:styleId="OperatorTok" w:type="character">
+    <w:name w:val="OperatorTok"/>
+    <w:basedOn w:val="VerbatimChar"/>
+    <w:rPr>
+      <w:color w:val="666666"/>
+    </w:rPr>
+  </w:style>
+  <w:style w:customStyle="1" w:styleId="BuiltInTok" w:type="character">
+    <w:name w:val="BuiltInTok"/>
+    <w:basedOn w:val="VerbatimChar"/>
+    <w:rPr>
+      <w:color w:val="008000"/>
+    </w:rPr>
+  </w:style>
+  <w:style w:customStyle="1" w:styleId="ExtensionTok" w:type="character">
+    <w:name w:val="ExtensionTok"/>
+    <w:basedOn w:val="VerbatimChar"/>
+    <w:rPr/>
+  </w:style>
+  <w:style w:customStyle="1" w:styleId="PreprocessorTok" w:type="character">
+    <w:name w:val="PreprocessorTok"/>
+    <w:basedOn w:val="VerbatimChar"/>
+    <w:rPr>
+      <w:color w:val="bc7a00"/>
+    </w:rPr>
+  </w:style>
+  <w:style w:customStyle="1" w:styleId="AttributeTok" w:type="character">
+    <w:name w:val="AttributeTok"/>
+    <w:basedOn w:val="VerbatimChar"/>
+    <w:rPr>
+      <w:color w:val="7d9029"/>
+    </w:rPr>
+  </w:style>
+  <w:style w:customStyle="1" w:styleId="RegionMarkerTok" w:type="character">
+    <w:name w:val="RegionMarkerTok"/>
+    <w:basedOn w:val="VerbatimChar"/>
+    <w:rPr/>
+  </w:style>
+  <w:style w:customStyle="1" w:styleId="InformationTok" w:type="character">
+    <w:name w:val="InformationTok"/>
+    <w:basedOn w:val="VerbatimChar"/>
+    <w:rPr>
+      <w:b/>
+      <w:i/>
+      <w:color w:val="60a0b0"/>
+    </w:rPr>
+  </w:style>
+  <w:style w:customStyle="1" w:styleId="WarningTok" w:type="character">
+    <w:name w:val="WarningTok"/>
+    <w:basedOn w:val="VerbatimChar"/>
+    <w:rPr>
+      <w:b/>
+      <w:i/>
+      <w:color w:val="60a0b0"/>
+    </w:rPr>
+  </w:style>
+  <w:style w:customStyle="1" w:styleId="AlertTok" w:type="character">
+    <w:name w:val="AlertTok"/>
+    <w:basedOn w:val="VerbatimChar"/>
+    <w:rPr>
+      <w:b/>
+      <w:color w:val="ff0000"/>
+    </w:rPr>
+  </w:style>
+  <w:style w:customStyle="1" w:styleId="ErrorTok" w:type="character">
+    <w:name w:val="ErrorTok"/>
+    <w:basedOn w:val="VerbatimChar"/>
+    <w:rPr>
+      <w:b/>
+      <w:color w:val="ff0000"/>
+    </w:rPr>
+  </w:style>
+  <w:style w:customStyle="1" w:styleId="NormalTok" w:type="character">
+    <w:name w:val="NormalTok"/>
+    <w:basedOn w:val="VerbatimChar"/>
+    <w:rPr/>
+  </w:style>
+  <w:style w:styleId="Table" w:type="table">
+    <w:name w:val="Table"/>
+    <w:tblPr>
+      <w:tblBorders>
+        <w:top w:color="000000" w:space="0" w:sz="4" w:val="single"/>
+        <w:left w:color="000000" w:space="0" w:sz="4" w:val="single"/>
+        <w:bottom w:color="000000" w:space="0" w:sz="4" w:val="single"/>
+        <w:right w:color="000000" w:space="0" w:sz="4" w:val="single"/>
+        <w:insideH w:color="000000" w:space="0" w:sz="4" w:val="single"/>
+        <w:insideV w:color="000000" w:space="0" w:sz="4" w:val="single"/>
+      </w:tblBorders>
+    </w:tblPr>
+  </w:style>
   <w:style w:type="paragraph" w:customStyle="1" w:styleId="SourceCode">
     <w:name w:val="Source Code"/>
     <w:basedOn w:val="Normal"/>
@@ -4386,19 +4633,6 @@
     <w:name w:val="NormalTok"/>
     <w:basedOn w:val="VerbatimChar"/>
     <w:rPr/>
-  </w:style>
-  <w:style w:type="table" w:styleId="Table">
-    <w:name w:val="Table"/>
-    <w:tblPr>
-      <w:tblBorders>
-        <w:top w:val="single" w:sz="4" w:space="0" w:color="000000"/>
-        <w:left w:val="single" w:sz="4" w:space="0" w:color="000000"/>
-        <w:bottom w:val="single" w:sz="4" w:space="0" w:color="000000"/>
-        <w:right w:val="single" w:sz="4" w:space="0" w:color="000000"/>
-        <w:insideH w:val="single" w:sz="4" w:space="0" w:color="000000"/>
-        <w:insideV w:val="single" w:sz="4" w:space="0" w:color="000000"/>
-      </w:tblBorders>
-    </w:tblPr>
   </w:style>
 </w:styles>
 </file>

</xml_diff>